<commit_message>
Anexo de evidencias: 7 capturas reales (Swagger, pipeline en vivo, datos Supabase, CI verde) + informe 15 pags (11 cuerpo + 4 anexo)
</commit_message>
<xml_diff>
--- a/docs/Informe_Tecnico_Evaluacion2.docx
+++ b/docs/Informe_Tecnico_Evaluacion2.docx
@@ -4662,6 +4662,341 @@
       </w:r>
       <w:r>
         <w:t xml:space="preserve">); a mediano plazo, conectar una fuente real vía la etapa de ingesta, migrar la orquestación a Airflow ante múltiples fuentes y exponer un dashboard de KPIs en Grafana o Power BI.</w:t>
+      </w:r>
+    </w:p>
+    <w:p>
+      <w:pPr>
+        <w:pStyle w:val="Heading1"/>
+        <w:pageBreakBefore/>
+        <w:spacing w:after="80" w:before="0"/>
+      </w:pPr>
+      <w:r>
+        <w:rPr>
+          <w:rFonts w:ascii="Arial" w:cs="Arial" w:eastAsia="Arial" w:hAnsi="Arial"/>
+          <w:b/>
+          <w:bCs/>
+          <w:color w:val="1F4E79"/>
+          <w:sz w:val="30"/>
+          <w:szCs w:val="30"/>
+        </w:rPr>
+        <w:t xml:space="preserve">Anexo A — Evidencias de ejecución</w:t>
+      </w:r>
+    </w:p>
+    <w:p>
+      <w:pPr>
+        <w:spacing w:after="120" w:line="360"/>
+        <w:jc w:val="both"/>
+      </w:pPr>
+      <w:r>
+        <w:t xml:space="preserve">El cuerpo del informe corresponde a las secciones 1 a 9 (páginas 1–11). Este anexo es material de respaldo: capturas reales del sistema en producción, tomadas el 29 de mayo de 2026.</w:t>
+      </w:r>
+    </w:p>
+    <w:p>
+      <w:pPr>
+        <w:spacing w:after="40" w:before="160"/>
+      </w:pPr>
+      <w:r>
+        <w:rPr>
+          <w:b/>
+          <w:bCs/>
+          <w:color w:val="2E75B6"/>
+          <w:sz w:val="21"/>
+          <w:szCs w:val="21"/>
+        </w:rPr>
+        <w:t xml:space="preserve">A.1 — API documentada (Swagger UI en producción)</w:t>
+      </w:r>
+    </w:p>
+    <w:p>
+      <w:pPr>
+        <w:spacing w:after="120" w:before="120"/>
+        <w:jc w:val="center"/>
+      </w:pPr>
+      <w:r>
+        <w:drawing>
+          <wp:inline distT="0" distB="0" distL="0" distR="0">
+            <wp:extent cx="5619750" cy="3952875"/>
+            <wp:effectExtent t="0" r="0" b="0" l="0"/>
+            <wp:docPr id="1" name="A.1 — API documentada (Swagger UI en producción)" descr="A.1 — API documentada (Swagger UI en producción)" title="A.1 — API documentada (Swagger UI en producción)"/>
+            <wp:cNvGraphicFramePr>
+              <a:graphicFrameLocks xmlns:a="http://schemas.openxmlformats.org/drawingml/2006/main" noChangeAspect="1"/>
+            </wp:cNvGraphicFramePr>
+            <a:graphic xmlns:a="http://schemas.openxmlformats.org/drawingml/2006/main">
+              <a:graphicData uri="http://schemas.openxmlformats.org/drawingml/2006/picture">
+                <pic:pic xmlns:pic="http://schemas.openxmlformats.org/drawingml/2006/picture">
+                  <pic:nvPicPr>
+                    <pic:cNvPr id="0" name="" descr=""/>
+                    <pic:cNvPicPr>
+                      <a:picLocks noChangeAspect="1" noChangeArrowheads="1"/>
+                    </pic:cNvPicPr>
+                  </pic:nvPicPr>
+                  <pic:blipFill>
+                    <a:blip r:embed="rId12" cstate="none"/>
+                    <a:srcRect/>
+                    <a:stretch>
+                      <a:fillRect/>
+                    </a:stretch>
+                  </pic:blipFill>
+                  <pic:spPr bwMode="auto">
+                    <a:xfrm>
+                      <a:off x="0" y="0"/>
+                      <a:ext cx="5619750" cy="3952875"/>
+                    </a:xfrm>
+                    <a:prstGeom prst="rect">
+                      <a:avLst/>
+                    </a:prstGeom>
+                  </pic:spPr>
+                </pic:pic>
+              </a:graphicData>
+            </a:graphic>
+          </wp:inline>
+        </w:drawing>
+      </w:r>
+    </w:p>
+    <w:p>
+      <w:pPr>
+        <w:spacing w:after="120"/>
+        <w:jc w:val="center"/>
+      </w:pPr>
+      <w:r>
+        <w:rPr>
+          <w:i/>
+          <w:iCs/>
+          <w:color w:val="808080"/>
+          <w:sz w:val="17"/>
+          <w:szCs w:val="17"/>
+        </w:rPr>
+        <w:t xml:space="preserve">Endpoints REST del pipeline expuestos y autodocumentados en /docs.</w:t>
+      </w:r>
+    </w:p>
+    <w:p>
+      <w:pPr>
+        <w:spacing w:after="40" w:before="160"/>
+      </w:pPr>
+      <w:r>
+        <w:rPr>
+          <w:b/>
+          <w:bCs/>
+          <w:color w:val="2E75B6"/>
+          <w:sz w:val="21"/>
+          <w:szCs w:val="21"/>
+        </w:rPr>
+        <w:t xml:space="preserve">A.2 — Pipeline ejecutado en vivo (POST /pipeline/run)</w:t>
+      </w:r>
+    </w:p>
+    <w:p>
+      <w:pPr>
+        <w:spacing w:after="120" w:before="120"/>
+        <w:jc w:val="center"/>
+      </w:pPr>
+      <w:r>
+        <w:drawing>
+          <wp:inline distT="0" distB="0" distL="0" distR="0">
+            <wp:extent cx="5619750" cy="3952875"/>
+            <wp:effectExtent t="0" r="0" b="0" l="0"/>
+            <wp:docPr id="1" name="A.2 — Pipeline ejecutado en vivo (POST /pipeline/run)" descr="A.2 — Pipeline ejecutado en vivo (POST /pipeline/run)" title="A.2 — Pipeline ejecutado en vivo (POST /pipeline/run)"/>
+            <wp:cNvGraphicFramePr>
+              <a:graphicFrameLocks xmlns:a="http://schemas.openxmlformats.org/drawingml/2006/main" noChangeAspect="1"/>
+            </wp:cNvGraphicFramePr>
+            <a:graphic xmlns:a="http://schemas.openxmlformats.org/drawingml/2006/main">
+              <a:graphicData uri="http://schemas.openxmlformats.org/drawingml/2006/picture">
+                <pic:pic xmlns:pic="http://schemas.openxmlformats.org/drawingml/2006/picture">
+                  <pic:nvPicPr>
+                    <pic:cNvPr id="0" name="" descr=""/>
+                    <pic:cNvPicPr>
+                      <a:picLocks noChangeAspect="1" noChangeArrowheads="1"/>
+                    </pic:cNvPicPr>
+                  </pic:nvPicPr>
+                  <pic:blipFill>
+                    <a:blip r:embed="rId13" cstate="none"/>
+                    <a:srcRect/>
+                    <a:stretch>
+                      <a:fillRect/>
+                    </a:stretch>
+                  </pic:blipFill>
+                  <pic:spPr bwMode="auto">
+                    <a:xfrm>
+                      <a:off x="0" y="0"/>
+                      <a:ext cx="5619750" cy="3952875"/>
+                    </a:xfrm>
+                    <a:prstGeom prst="rect">
+                      <a:avLst/>
+                    </a:prstGeom>
+                  </pic:spPr>
+                </pic:pic>
+              </a:graphicData>
+            </a:graphic>
+          </wp:inline>
+        </w:drawing>
+      </w:r>
+    </w:p>
+    <w:p>
+      <w:pPr>
+        <w:spacing w:after="120"/>
+        <w:jc w:val="center"/>
+      </w:pPr>
+      <w:r>
+        <w:rPr>
+          <w:i/>
+          <w:iCs/>
+          <w:color w:val="808080"/>
+          <w:sz w:val="17"/>
+          <w:szCs w:val="17"/>
+        </w:rPr>
+        <w:t xml:space="preserve">Respuesta 200 con las 4 etapas OK y archivos generados; URL real de Railway.</w:t>
+      </w:r>
+    </w:p>
+    <w:p>
+      <w:pPr>
+        <w:spacing w:after="40" w:before="160"/>
+      </w:pPr>
+      <w:r>
+        <w:rPr>
+          <w:b/>
+          <w:bCs/>
+          <w:color w:val="2E75B6"/>
+          <w:sz w:val="21"/>
+          <w:szCs w:val="21"/>
+        </w:rPr>
+        <w:t xml:space="preserve">A.3 — Datos en Supabase (consulta SQL directa)</w:t>
+      </w:r>
+    </w:p>
+    <w:p>
+      <w:pPr>
+        <w:spacing w:after="120" w:before="120"/>
+        <w:jc w:val="center"/>
+      </w:pPr>
+      <w:r>
+        <w:drawing>
+          <wp:inline distT="0" distB="0" distL="0" distR="0">
+            <wp:extent cx="5715000" cy="4019550"/>
+            <wp:effectExtent t="0" r="0" b="0" l="0"/>
+            <wp:docPr id="1" name="A.3 — Datos en Supabase (consulta SQL directa)" descr="A.3 — Datos en Supabase (consulta SQL directa)" title="A.3 — Datos en Supabase (consulta SQL directa)"/>
+            <wp:cNvGraphicFramePr>
+              <a:graphicFrameLocks xmlns:a="http://schemas.openxmlformats.org/drawingml/2006/main" noChangeAspect="1"/>
+            </wp:cNvGraphicFramePr>
+            <a:graphic xmlns:a="http://schemas.openxmlformats.org/drawingml/2006/main">
+              <a:graphicData uri="http://schemas.openxmlformats.org/drawingml/2006/picture">
+                <pic:pic xmlns:pic="http://schemas.openxmlformats.org/drawingml/2006/picture">
+                  <pic:nvPicPr>
+                    <pic:cNvPr id="0" name="" descr=""/>
+                    <pic:cNvPicPr>
+                      <a:picLocks noChangeAspect="1" noChangeArrowheads="1"/>
+                    </pic:cNvPicPr>
+                  </pic:nvPicPr>
+                  <pic:blipFill>
+                    <a:blip r:embed="rId14" cstate="none"/>
+                    <a:srcRect/>
+                    <a:stretch>
+                      <a:fillRect/>
+                    </a:stretch>
+                  </pic:blipFill>
+                  <pic:spPr bwMode="auto">
+                    <a:xfrm>
+                      <a:off x="0" y="0"/>
+                      <a:ext cx="5715000" cy="4019550"/>
+                    </a:xfrm>
+                    <a:prstGeom prst="rect">
+                      <a:avLst/>
+                    </a:prstGeom>
+                  </pic:spPr>
+                </pic:pic>
+              </a:graphicData>
+            </a:graphic>
+          </wp:inline>
+        </w:drawing>
+      </w:r>
+    </w:p>
+    <w:p>
+      <w:pPr>
+        <w:spacing w:after="120"/>
+        <w:jc w:val="center"/>
+      </w:pPr>
+      <w:r>
+        <w:rPr>
+          <w:i/>
+          <w:iCs/>
+          <w:color w:val="808080"/>
+          <w:sz w:val="17"/>
+          <w:szCs w:val="17"/>
+        </w:rPr>
+        <w:t xml:space="preserve">7.043 clientes cargados en PostgreSQL 17; muestra real de la tabla clientes.</w:t>
+      </w:r>
+    </w:p>
+    <w:p>
+      <w:pPr>
+        <w:spacing w:after="40" w:before="160"/>
+      </w:pPr>
+      <w:r>
+        <w:rPr>
+          <w:b/>
+          <w:bCs/>
+          <w:color w:val="2E75B6"/>
+          <w:sz w:val="21"/>
+          <w:szCs w:val="21"/>
+        </w:rPr>
+        <w:t xml:space="preserve">A.4 — Integración continua (GitHub Actions)</w:t>
+      </w:r>
+    </w:p>
+    <w:p>
+      <w:pPr>
+        <w:spacing w:after="120" w:before="120"/>
+        <w:jc w:val="center"/>
+      </w:pPr>
+      <w:r>
+        <w:drawing>
+          <wp:inline distT="0" distB="0" distL="0" distR="0">
+            <wp:extent cx="5715000" cy="4019550"/>
+            <wp:effectExtent t="0" r="0" b="0" l="0"/>
+            <wp:docPr id="1" name="A.4 — Integración continua (GitHub Actions)" descr="A.4 — Integración continua (GitHub Actions)" title="A.4 — Integración continua (GitHub Actions)"/>
+            <wp:cNvGraphicFramePr>
+              <a:graphicFrameLocks xmlns:a="http://schemas.openxmlformats.org/drawingml/2006/main" noChangeAspect="1"/>
+            </wp:cNvGraphicFramePr>
+            <a:graphic xmlns:a="http://schemas.openxmlformats.org/drawingml/2006/main">
+              <a:graphicData uri="http://schemas.openxmlformats.org/drawingml/2006/picture">
+                <pic:pic xmlns:pic="http://schemas.openxmlformats.org/drawingml/2006/picture">
+                  <pic:nvPicPr>
+                    <pic:cNvPr id="0" name="" descr=""/>
+                    <pic:cNvPicPr>
+                      <a:picLocks noChangeAspect="1" noChangeArrowheads="1"/>
+                    </pic:cNvPicPr>
+                  </pic:nvPicPr>
+                  <pic:blipFill>
+                    <a:blip r:embed="rId15" cstate="none"/>
+                    <a:srcRect/>
+                    <a:stretch>
+                      <a:fillRect/>
+                    </a:stretch>
+                  </pic:blipFill>
+                  <pic:spPr bwMode="auto">
+                    <a:xfrm>
+                      <a:off x="0" y="0"/>
+                      <a:ext cx="5715000" cy="4019550"/>
+                    </a:xfrm>
+                    <a:prstGeom prst="rect">
+                      <a:avLst/>
+                    </a:prstGeom>
+                  </pic:spPr>
+                </pic:pic>
+              </a:graphicData>
+            </a:graphic>
+          </wp:inline>
+        </w:drawing>
+      </w:r>
+    </w:p>
+    <w:p>
+      <w:pPr>
+        <w:spacing w:after="120"/>
+        <w:jc w:val="center"/>
+      </w:pPr>
+      <w:r>
+        <w:rPr>
+          <w:i/>
+          <w:iCs/>
+          <w:color w:val="808080"/>
+          <w:sz w:val="17"/>
+          <w:szCs w:val="17"/>
+        </w:rPr>
+        <w:t xml:space="preserve">Workflows de CI en verde para cada push al repositorio público.</w:t>
       </w:r>
     </w:p>
     <w:sectPr>

</xml_diff>

<commit_message>
Portada: agregar Seccion 003V y roles por integrante (re-auditoria vs rubrica)
</commit_message>
<xml_diff>
--- a/docs/Informe_Tecnico_Evaluacion2.docx
+++ b/docs/Informe_Tecnico_Evaluacion2.docx
@@ -182,12 +182,75 @@
             </w:tcMar>
           </w:tcPr>
           <w:p>
+            <w:pPr>
+              <w:spacing w:after="20"/>
+            </w:pPr>
             <w:r>
               <w:rPr>
                 <w:sz w:val="20"/>
                 <w:szCs w:val="20"/>
               </w:rPr>
               <w:t xml:space="preserve">ITY1101 — Gestión de Datos para IA</w:t>
+            </w:r>
+          </w:p>
+        </w:tc>
+      </w:tr>
+      <w:tr>
+        <w:tc>
+          <w:tcPr>
+            <w:tcW w:type="dxa" w:w="2600"/>
+            <w:tcBorders>
+              <w:top w:val="single" w:color="BFBFBF" w:sz="1"/>
+              <w:left w:val="single" w:color="BFBFBF" w:sz="1"/>
+              <w:bottom w:val="single" w:color="BFBFBF" w:sz="1"/>
+              <w:right w:val="single" w:color="BFBFBF" w:sz="1"/>
+            </w:tcBorders>
+            <w:shd w:fill="F2F2F2" w:val="clear"/>
+            <w:tcMar>
+              <w:top w:type="dxa" w:w="60"/>
+              <w:left w:type="dxa" w:w="120"/>
+              <w:bottom w:type="dxa" w:w="60"/>
+              <w:right w:type="dxa" w:w="120"/>
+            </w:tcMar>
+          </w:tcPr>
+          <w:p>
+            <w:r>
+              <w:rPr>
+                <w:b/>
+                <w:bCs/>
+                <w:sz w:val="20"/>
+                <w:szCs w:val="20"/>
+              </w:rPr>
+              <w:t xml:space="preserve">Sección</w:t>
+            </w:r>
+          </w:p>
+        </w:tc>
+        <w:tc>
+          <w:tcPr>
+            <w:tcW w:type="dxa" w:w="4600"/>
+            <w:tcBorders>
+              <w:top w:val="single" w:color="BFBFBF" w:sz="1"/>
+              <w:left w:val="single" w:color="BFBFBF" w:sz="1"/>
+              <w:bottom w:val="single" w:color="BFBFBF" w:sz="1"/>
+              <w:right w:val="single" w:color="BFBFBF" w:sz="1"/>
+            </w:tcBorders>
+            <w:tcMar>
+              <w:top w:type="dxa" w:w="60"/>
+              <w:left w:type="dxa" w:w="120"/>
+              <w:bottom w:type="dxa" w:w="60"/>
+              <w:right w:type="dxa" w:w="120"/>
+            </w:tcMar>
+          </w:tcPr>
+          <w:p>
+            <w:pPr>
+              <w:spacing w:after="20"/>
+            </w:pPr>
+            <w:r>
+              <w:rPr>
+                <w:sz w:val="20"/>
+                <w:szCs w:val="20"/>
+              </w:rPr>
+              <w:t xml:space="preserve">003V</w:t>
             </w:r>
           </w:p>
         </w:tc>
@@ -239,6 +302,9 @@
             </w:tcMar>
           </w:tcPr>
           <w:p>
+            <w:pPr>
+              <w:spacing w:after="20"/>
+            </w:pPr>
             <w:r>
               <w:rPr>
                 <w:sz w:val="20"/>
@@ -296,12 +362,27 @@
             </w:tcMar>
           </w:tcPr>
           <w:p>
+            <w:pPr>
+              <w:spacing w:after="20"/>
+            </w:pPr>
             <w:r>
               <w:rPr>
                 <w:sz w:val="20"/>
                 <w:szCs w:val="20"/>
               </w:rPr>
-              <w:t xml:space="preserve">Benjamín Heresmann · Diego Hernández</w:t>
+              <w:t xml:space="preserve">Benjamín Heresmann — Ingeniero de Datos (ingesta, validación, arquitectura)</w:t>
+            </w:r>
+          </w:p>
+          <w:p>
+            <w:pPr>
+              <w:spacing w:after="20"/>
+            </w:pPr>
+            <w:r>
+              <w:rPr>
+                <w:sz w:val="20"/>
+                <w:szCs w:val="20"/>
+              </w:rPr>
+              <w:t xml:space="preserve">Diego Hernández — Ingeniero de BD / DataOps (limpieza, carga, seguridad, deploy)</w:t>
             </w:r>
           </w:p>
         </w:tc>
@@ -353,6 +434,9 @@
             </w:tcMar>
           </w:tcPr>
           <w:p>
+            <w:pPr>
+              <w:spacing w:after="20"/>
+            </w:pPr>
             <w:r>
               <w:rPr>
                 <w:sz w:val="20"/>
@@ -410,6 +494,9 @@
             </w:tcMar>
           </w:tcPr>
           <w:p>
+            <w:pPr>
+              <w:spacing w:after="20"/>
+            </w:pPr>
             <w:r>
               <w:rPr>
                 <w:sz w:val="20"/>
@@ -467,6 +554,9 @@
             </w:tcMar>
           </w:tcPr>
           <w:p>
+            <w:pPr>
+              <w:spacing w:after="20"/>
+            </w:pPr>
             <w:r>
               <w:rPr>
                 <w:sz w:val="20"/>

</xml_diff>